<commit_message>
Add brand assets to public/brand
</commit_message>
<xml_diff>
--- a/docs/guides/Clariq_Guide_1_Clariq_Admin.docx
+++ b/docs/guides/Clariq_Guide_1_Clariq_Admin.docx
@@ -2955,7 +2955,7 @@
                 <w:i w:val="0"/>
                 <w:sz w:val="20"/>
               </w:rPr>
-              <w:t>. Tap Update. It takes a second and puts you back where you were. The number in the footer, for example v0.7.36, is the version you are on. Quote it if you report a problem.</w:t>
+              <w:t>. Tap Update. It takes a second and puts you back where you were. The number in the footer, for example v0.7.43, is the version you are on. Quote it if you report a problem.</w:t>
             </w:r>
           </w:p>
         </w:tc>
@@ -4937,7 +4937,7 @@
                 <w:i w:val="0"/>
                 <w:sz w:val="19"/>
               </w:rPr>
-              <w:t>Read the overdue digest email. It lists what is late, by customer, with the value at risk. Act on anything significantly overdue.</w:t>
+              <w:t>Coming, not yet built. When it is running it will list what is late, by customer, with the value at risk. Until then open What is overdue for return and do the same job by eye.</w:t>
             </w:r>
           </w:p>
         </w:tc>
@@ -4960,7 +4960,7 @@
                 <w:i w:val="0"/>
                 <w:sz w:val="19"/>
               </w:rPr>
-              <w:t>Your inbox, 7am</w:t>
+              <w:t>Your inbox, 7am, once the digest is running</w:t>
             </w:r>
           </w:p>
         </w:tc>
@@ -6348,7 +6348,7 @@
                 <w:i w:val="0"/>
                 <w:sz w:val="19"/>
               </w:rPr>
-              <w:t>Sign in emails from the Clariq domain</w:t>
+              <w:t>Sign in emails</w:t>
             </w:r>
           </w:p>
         </w:tc>
@@ -6372,7 +6372,7 @@
                 <w:i w:val="0"/>
                 <w:sz w:val="19"/>
               </w:rPr>
-              <w:t>Done</w:t>
+              <w:t>Working, temporary sender</w:t>
             </w:r>
           </w:p>
         </w:tc>
@@ -6395,7 +6395,7 @@
                 <w:i w:val="0"/>
                 <w:sz w:val="19"/>
               </w:rPr>
-              <w:t>Magic links now go out through Resend on clariq.nz rather than a Gmail account.</w:t>
+              <w:t>Magic links go out over Gmail SMTP from clariqnz@gmail.com, showing as Clariq in the inbox. Rate limited but fine at current volumes. Moves to Resend on noreply@clariq.nz once we have DNS access to clariq.nz: five SMTP fields on each project, nothing else changes.</w:t>
             </w:r>
           </w:p>
         </w:tc>
@@ -6467,7 +6467,7 @@
                 <w:i w:val="0"/>
                 <w:sz w:val="19"/>
               </w:rPr>
-              <w:t>The daily overdue digest is sent by a scheduled function calling Resend directly, not by the sign in mailer, so it needs its own key, a from address and a schedule. Magic link and invitation wording is still the plain default.</w:t>
+              <w:t>The daily overdue digest is not built. It is a scheduled function calling a mail API directly, and it is parked until the domain lands. Branded magic link and invitation templates are written and ready to install; the invitation is sent by the app, so customer facing invitations are held until the domain is verified.</w:t>
             </w:r>
           </w:p>
         </w:tc>

</xml_diff>